<commit_message>
Bake Renovate 8 builder details into templates; add logo hook
- Add scripts/config.json with Renovate 8 ABN, licence, address, contact
- Update build_notice_template.py and build_register_template.py to read
  builder values from config.json and substitute into the generated
  templates (falls back to {{BUILDER_*}} placeholders if config absent)
- Add logo hook: if templates/logo.png (.jpg/.jpeg) exists it replaces
  the "RENOVATE 8" text heading on the notice
- README: document logo drop-in
</commit_message>
<xml_diff>
--- a/templates/variation_notice_template.docx
+++ b/templates/variation_notice_template.docx
@@ -28,7 +28,7 @@
           <w:color w:val="595959"/>
           <w:sz w:val="18"/>
         </w:rPr>
-        <w:t>{{BUILDER_ADDRESS}}    |    ABN {{BUILDER_ABN}}    |    NSW Contractor Licence {{BUILDER_LICENCE}}</w:t>
+        <w:t>62 Budyan Road, Grays Point NSW 2232    |    ABN 72 098 695 446    |    NSW Contractor Licence 139701C</w:t>
       </w:r>
     </w:p>
     <w:p>
@@ -43,7 +43,7 @@
           <w:color w:val="595959"/>
           <w:sz w:val="18"/>
         </w:rPr>
-        <w:t>{{BUILDER_EMAIL}}    |    {{BUILDER_PHONE}}</w:t>
+        <w:t>paul@renovate8.com.au    |    0404 899 899</w:t>
       </w:r>
     </w:p>
     <w:p>
@@ -1279,7 +1279,7 @@
               <w:rPr>
                 <w:sz w:val="20"/>
               </w:rPr>
-              <w:t>Print name: {{BUILDER_SIGNATORY}}</w:t>
+              <w:t>Print name: Paul Metlege</w:t>
             </w:r>
           </w:p>
           <w:p>
@@ -1359,7 +1359,7 @@
           <w:color w:val="595959"/>
           <w:sz w:val="16"/>
         </w:rPr>
-        <w:t>Renovate 8  •  ABN {{BUILDER_ABN}}  •  NSW Contractor Licence {{BUILDER_LICENCE}}  •  Filed: {{VAR_NUMBER}} / v{{NOTICE_VERSION}}</w:t>
+        <w:t>Renovate 8  •  ABN 72 098 695 446  •  NSW Contractor Licence 139701C  •  Filed: {{VAR_NUMBER}} / v{{NOTICE_VERSION}}</w:t>
       </w:r>
     </w:p>
     <w:sectPr>

</xml_diff>

<commit_message>
Add Renovate 8 logo + Gold and Eagle Constructions legal entity
- Extract logo from supplied Annandale quotation document and save as
  templates/logo.jpg (271x39 JPEG)
- Add the licence-holder entity ("Gold and Eagle Constructions trading
  as Renovate 8") to the notice header and footer, plus a dedicated
  "Builder legal entity (licence holder)" row in the register's
  Project Setup tab
- Update defined-name row references in the register to match the new
  Project Setup layout
</commit_message>
<xml_diff>
--- a/templates/variation_notice_template.docx
+++ b/templates/variation_notice_template.docx
@@ -4,16 +4,56 @@
   <w:body>
     <w:p>
       <w:pPr>
-        <w:spacing w:before="160" w:after="80"/>
+        <w:jc w:val="center"/>
+      </w:pPr>
+      <w:r>
+        <w:drawing>
+          <wp:inline xmlns:a="http://schemas.openxmlformats.org/drawingml/2006/main" xmlns:pic="http://schemas.openxmlformats.org/drawingml/2006/picture">
+            <wp:extent cx="2160000" cy="310849"/>
+            <wp:docPr id="1" name="Picture 1"/>
+            <wp:cNvGraphicFramePr>
+              <a:graphicFrameLocks noChangeAspect="1"/>
+            </wp:cNvGraphicFramePr>
+            <a:graphic>
+              <a:graphicData uri="http://schemas.openxmlformats.org/drawingml/2006/picture">
+                <pic:pic>
+                  <pic:nvPicPr>
+                    <pic:cNvPr id="0" name="logo.jpg"/>
+                    <pic:cNvPicPr/>
+                  </pic:nvPicPr>
+                  <pic:blipFill>
+                    <a:blip r:embed="rId9"/>
+                    <a:stretch>
+                      <a:fillRect/>
+                    </a:stretch>
+                  </pic:blipFill>
+                  <pic:spPr>
+                    <a:xfrm>
+                      <a:off x="0" y="0"/>
+                      <a:ext cx="2160000" cy="310849"/>
+                    </a:xfrm>
+                    <a:prstGeom prst="rect"/>
+                  </pic:spPr>
+                </pic:pic>
+              </a:graphicData>
+            </a:graphic>
+          </wp:inline>
+        </w:drawing>
+      </w:r>
+    </w:p>
+    <w:p>
+      <w:pPr>
+        <w:spacing w:after="80"/>
         <w:jc w:val="center"/>
       </w:pPr>
       <w:r>
         <w:rPr>
           <w:b/>
-          <w:color w:val="1F3864"/>
-          <w:sz w:val="36"/>
+          <w:i w:val="0"/>
+          <w:color w:val="595959"/>
+          <w:sz w:val="20"/>
         </w:rPr>
-        <w:t>RENOVATE 8</w:t>
+        <w:t>Gold and Eagle Constructions trading as Renovate 8</w:t>
       </w:r>
     </w:p>
     <w:p>
@@ -1359,7 +1399,7 @@
           <w:color w:val="595959"/>
           <w:sz w:val="16"/>
         </w:rPr>
-        <w:t>Renovate 8  •  ABN 72 098 695 446  •  NSW Contractor Licence 139701C  •  Filed: {{VAR_NUMBER}} / v{{NOTICE_VERSION}}</w:t>
+        <w:t>Gold and Eagle Constructions trading as Renovate 8  •  ABN 72 098 695 446  •  NSW Contractor Licence 139701C  •  Filed: {{VAR_NUMBER}} / v{{NOTICE_VERSION}}</w:t>
       </w:r>
     </w:p>
     <w:sectPr>

</xml_diff>